<commit_message>
Remove redundant Active Stop legend entry (v7.0/v8.0)
The active marker color now matches the current library type, making
a separate fixed-blue Active Stop entry in the legend unnecessary.
Updated documentation (v7.0) and README (v8.0) to reflect the change.

Co-Authored-By: Claude Sonnet 4.6 <noreply@anthropic.com>
</commit_message>
<xml_diff>
--- a/Resource Sharing GIS Visualization/Resource_Sharing_GIS_Visualization_Documentation.docx
+++ b/Resource Sharing GIS Visualization/Resource_Sharing_GIS_Visualization_Documentation.docx
@@ -2488,6 +2488,16 @@
         <w:t>7.5 Color-Coded Library Types</w:t>
       </w:r>
     </w:p>
+    <w:p>
+      <w:r>
+        <w:rPr>
+          <w:rFonts w:ascii="Calibri" w:hAnsi="Calibri"/>
+          <w:b w:val="0"/>
+          <w:sz w:val="22"/>
+        </w:rPr>
+        <w:t>The on-screen legend lists library types and their colors. The former “Active Stop” entry (fixed blue #58a6ff) has been removed — the active marker now inherits the current library’s type color, making a separate entry redundant.</w:t>
+      </w:r>
+    </w:p>
     <w:p/>
     <w:tbl>
       <w:tblPr>
@@ -3845,7 +3855,7 @@
                 <w:b w:val="0"/>
                 <w:sz w:val="20"/>
               </w:rPr>
-              <w:t>6.0</w:t>
+              <w:t>7.0</w:t>
             </w:r>
           </w:p>
         </w:tc>

</xml_diff>